<commit_message>
Update Astra Tech role to reflect real merchant acquiring scope
Corrected from generic 'P2P/bill payments' framing to actual work: CIT/MIT
stored-credential payment compliance, DCC (dynamic currency conversion),
card/settlement data validation, and a SQL-injection defect found in
production. Updated CV (docx/pdf) and portfolio site.
</commit_message>
<xml_diff>
--- a/CV_Mohamed_Elaadly.docx
+++ b/CV_Mohamed_Elaadly.docx
@@ -150,7 +150,7 @@
           <w:spacing w:val="0"/>
           <w:color w:val="141414"/>
         </w:rPr>
-        <w:t xml:space="preserve">ISTQB-certified QA Engineer (Foundation, Test Automation Engineering, Performance Testing, Automotive) with 3+ years testing web, mobile, and API systems across fintech, automotive safety, and AI/ML products. Currently lead QA for a fintech mobile wallet serving millions of users at Astra Tech, where I raised automated test coverage from 60% to 87% and mentor a team of three engineers. Built automation frameworks in Playwright, Appium, and REST Assured across Java and Python, and have validated AI systems (static analysis, NLP, classification) for correctness beyond fixed-answer testing. Comfortable owning quality end-to-end: test strategy, framework architecture, CI/CD integration, and defect triage in Agile teams with distributed stakeholders (Germany, Romania, UAE, Egypt).</w:t>
+        <w:t xml:space="preserve">ISTQB-certified QA Engineer (Foundation, Test Automation Engineering, Performance Testing, Automotive) with 3+ years testing web, mobile, and API systems across fintech payments, automotive safety, and AI/ML products. Currently lead QA for Astra Tech's merchant acquiring platform, specializing in CIT/MIT-compliant payment flows (the Visa/Mastercard stored-credential framework), dynamic currency conversion (DCC), and card/settlement data integrity — where I raised automated test coverage from 60% to 87% and mentor a team of three engineers. Built automation frameworks in Playwright, Appium, and REST Assured across Java and Python, and have validated AI systems (static analysis, NLP, classification) for correctness beyond fixed-answer testing. Comfortable owning quality end-to-end: test strategy, framework architecture, CI/CD integration, and defect triage in Agile teams with distributed stakeholders (Germany, Romania, UAE, Egypt).</w:t>
       </w:r>
     </w:p>
     <w:p>
@@ -227,65 +227,94 @@
           <w:spacing w:val="0"/>
           <w:color w:val="141414"/>
         </w:rPr>
-        <w:t xml:space="preserve">Lead QA for a fintech mobile wallet processing P2P transfers, bill payments, and merchant transactions for millions of active users.</w:t>
-      </w:r>
-    </w:p>
-    <w:p>
-      <w:pPr>
-        <w:ind w:left="720" w:first-line="-720"/>
-        <w:spacing w:after="30"/>
-      </w:pPr>
-      <w:r>
-        <w:rPr>
-          <w:rFonts w:ascii="Arial" w:hAnsi="Arial" w:cs="Arial"/>
-          <w:sz w:val="26"/>
-          <w:sz-cs w:val="26"/>
-          <w:color w:val="141414"/>
-        </w:rPr>
-        <w:t xml:space="preserve"/>
-        <w:tab/>
-        <w:t xml:space="preserve">•</w:t>
-        <w:tab/>
-        <w:t xml:space="preserve"/>
-      </w:r>
-      <w:r>
-        <w:rPr>
-          <w:rFonts w:ascii="Arial" w:hAnsi="Arial" w:cs="Arial"/>
-          <w:sz w:val="26"/>
-          <w:sz-cs w:val="26"/>
-          <w:spacing w:val="0"/>
-          <w:color w:val="141414"/>
-        </w:rPr>
-        <w:t xml:space="preserve">Raised automated test coverage from 60% to 87% by building and scaling a Playwright (UI) and Appium (iOS/Android) automation suite in Java with TestNG and Cucumber BDD.</w:t>
-      </w:r>
-    </w:p>
-    <w:p>
-      <w:pPr>
-        <w:ind w:left="720" w:first-line="-720"/>
-        <w:spacing w:after="30"/>
-      </w:pPr>
-      <w:r>
-        <w:rPr>
-          <w:rFonts w:ascii="Arial" w:hAnsi="Arial" w:cs="Arial"/>
-          <w:sz w:val="26"/>
-          <w:sz-cs w:val="26"/>
-          <w:color w:val="141414"/>
-        </w:rPr>
-        <w:t xml:space="preserve"/>
-        <w:tab/>
-        <w:t xml:space="preserve">•</w:t>
-        <w:tab/>
-        <w:t xml:space="preserve"/>
-      </w:r>
-      <w:r>
-        <w:rPr>
-          <w:rFonts w:ascii="Arial" w:hAnsi="Arial" w:cs="Arial"/>
-          <w:sz w:val="26"/>
-          <w:sz-cs w:val="26"/>
-          <w:spacing w:val="0"/>
-          <w:color w:val="141414"/>
-        </w:rPr>
-        <w:t xml:space="preserve">Own API test automation using REST Assured and Postman, validating payment workflows against MongoDB and MySQL test data stores.</w:t>
+        <w:t xml:space="preserve">Lead QA for Astra Tech's merchant acquiring platform, covering CIT/MIT-compliant payment flows (Visa/Mastercard stored-credential framework), dynamic currency conversion (DCC) configuration, and merchant onboarding/configuration across millions of transactions.</w:t>
+      </w:r>
+    </w:p>
+    <w:p>
+      <w:pPr>
+        <w:ind w:left="720" w:first-line="-720"/>
+        <w:spacing w:after="30"/>
+      </w:pPr>
+      <w:r>
+        <w:rPr>
+          <w:rFonts w:ascii="Arial" w:hAnsi="Arial" w:cs="Arial"/>
+          <w:sz w:val="26"/>
+          <w:sz-cs w:val="26"/>
+          <w:color w:val="141414"/>
+        </w:rPr>
+        <w:t xml:space="preserve"/>
+        <w:tab/>
+        <w:t xml:space="preserve">•</w:t>
+        <w:tab/>
+        <w:t xml:space="preserve"/>
+      </w:r>
+      <w:r>
+        <w:rPr>
+          <w:rFonts w:ascii="Arial" w:hAnsi="Arial" w:cs="Arial"/>
+          <w:sz w:val="26"/>
+          <w:sz-cs w:val="26"/>
+          <w:spacing w:val="0"/>
+          <w:color w:val="141414"/>
+        </w:rPr>
+        <w:t xml:space="preserve">Designed and executed test coverage spanning API, database, and reporting layers — including DCC rebate/markup calculation, multi-currency settlement, and card BIN data validation pipelines.</w:t>
+      </w:r>
+    </w:p>
+    <w:p>
+      <w:pPr>
+        <w:ind w:left="720" w:first-line="-720"/>
+        <w:spacing w:after="30"/>
+      </w:pPr>
+      <w:r>
+        <w:rPr>
+          <w:rFonts w:ascii="Arial" w:hAnsi="Arial" w:cs="Arial"/>
+          <w:sz w:val="26"/>
+          <w:sz-cs w:val="26"/>
+          <w:color w:val="141414"/>
+        </w:rPr>
+        <w:t xml:space="preserve"/>
+        <w:tab/>
+        <w:t xml:space="preserve">•</w:t>
+        <w:tab/>
+        <w:t xml:space="preserve"/>
+      </w:r>
+      <w:r>
+        <w:rPr>
+          <w:rFonts w:ascii="Arial" w:hAnsi="Arial" w:cs="Arial"/>
+          <w:sz w:val="26"/>
+          <w:sz-cs w:val="26"/>
+          <w:spacing w:val="0"/>
+          <w:color w:val="141414"/>
+        </w:rPr>
+        <w:t xml:space="preserve">Built and scaled automation suites (Playwright, Appium, REST Assured) in Java with TestNG and Cucumber BDD, raising automated test coverage from 60% to 87%.</w:t>
+      </w:r>
+    </w:p>
+    <w:p>
+      <w:pPr>
+        <w:ind w:left="720" w:first-line="-720"/>
+        <w:spacing w:after="30"/>
+      </w:pPr>
+      <w:r>
+        <w:rPr>
+          <w:rFonts w:ascii="Arial" w:hAnsi="Arial" w:cs="Arial"/>
+          <w:sz w:val="26"/>
+          <w:sz-cs w:val="26"/>
+          <w:color w:val="141414"/>
+        </w:rPr>
+        <w:t xml:space="preserve"/>
+        <w:tab/>
+        <w:t xml:space="preserve">•</w:t>
+        <w:tab/>
+        <w:t xml:space="preserve"/>
+      </w:r>
+      <w:r>
+        <w:rPr>
+          <w:rFonts w:ascii="Arial" w:hAnsi="Arial" w:cs="Arial"/>
+          <w:sz w:val="26"/>
+          <w:sz-cs w:val="26"/>
+          <w:spacing w:val="0"/>
+          <w:color w:val="141414"/>
+        </w:rPr>
+        <w:t xml:space="preserve">Identified and drove to resolution production-impacting defects across the stack, including a SQL-injection input-validation gap in a card-data import pipeline and multiple currency/configuration edge cases in DCC rebate calculation.</w:t>
       </w:r>
     </w:p>
     <w:p>

</xml_diff>

<commit_message>
Expand Astra Tech experience: Payment Core (recurring payments) and Merchant Portal
Adds explicit coverage of recurring/tokenized payment testing and merchant-facing
admin portal testing (DCC/rebate views, statement downloads, auth config) to the
CV and portfolio site, alongside the existing merchant acquiring/DCC/CIT-MIT scope.
</commit_message>
<xml_diff>
--- a/CV_Mohamed_Elaadly.docx
+++ b/CV_Mohamed_Elaadly.docx
@@ -150,7 +150,7 @@
           <w:spacing w:val="0"/>
           <w:color w:val="141414"/>
         </w:rPr>
-        <w:t xml:space="preserve">ISTQB-certified QA Engineer (Foundation, Test Automation Engineering, Performance Testing, Automotive) with 3+ years testing web, mobile, and API systems across fintech payments, automotive safety, and AI/ML products. Currently lead QA for Astra Tech's merchant acquiring platform, specializing in CIT/MIT-compliant payment flows (the Visa/Mastercard stored-credential framework), dynamic currency conversion (DCC), and card/settlement data integrity — where I raised automated test coverage from 60% to 87% and mentor a team of three engineers. Built automation frameworks in Playwright, Appium, and REST Assured across Java and Python, and have validated AI systems (static analysis, NLP, classification) for correctness beyond fixed-answer testing. Comfortable owning quality end-to-end: test strategy, framework architecture, CI/CD integration, and defect triage in Agile teams with distributed stakeholders (Germany, Romania, UAE, Egypt).</w:t>
+        <w:t xml:space="preserve">ISTQB-certified QA Engineer (Foundation, Test Automation Engineering, Performance Testing, Automotive) with 3+ years testing web, mobile, and API systems across fintech payments, automotive safety, and AI/ML products. Currently lead QA for Astra Tech's merchant acquiring &amp; payment core platform (Botim), covering CIT/MIT-compliant payment flows (the Visa/Mastercard stored-credential framework), recurring/tokenized payments, dynamic currency conversion (DCC), card data integrity, and the merchant-facing admin portal — where I raised automated test coverage from 60% to 87% and mentor a team of three engineers. Built automation frameworks in Playwright, Appium, and REST Assured across Java and Python, and have validated AI systems (static analysis, NLP, classification) for correctness beyond fixed-answer testing. Comfortable owning quality end-to-end: test strategy, framework architecture, CI/CD integration, and defect triage in Agile teams with distributed stakeholders (Germany, Romania, UAE, Egypt).</w:t>
       </w:r>
     </w:p>
     <w:p>
@@ -227,36 +227,65 @@
           <w:spacing w:val="0"/>
           <w:color w:val="141414"/>
         </w:rPr>
-        <w:t xml:space="preserve">Lead QA for Astra Tech's merchant acquiring platform, covering CIT/MIT-compliant payment flows (Visa/Mastercard stored-credential framework), dynamic currency conversion (DCC) configuration, and merchant onboarding/configuration across millions of transactions.</w:t>
-      </w:r>
-    </w:p>
-    <w:p>
-      <w:pPr>
-        <w:ind w:left="720" w:first-line="-720"/>
-        <w:spacing w:after="30"/>
-      </w:pPr>
-      <w:r>
-        <w:rPr>
-          <w:rFonts w:ascii="Arial" w:hAnsi="Arial" w:cs="Arial"/>
-          <w:sz w:val="26"/>
-          <w:sz-cs w:val="26"/>
-          <w:color w:val="141414"/>
-        </w:rPr>
-        <w:t xml:space="preserve"/>
-        <w:tab/>
-        <w:t xml:space="preserve">•</w:t>
-        <w:tab/>
-        <w:t xml:space="preserve"/>
-      </w:r>
-      <w:r>
-        <w:rPr>
-          <w:rFonts w:ascii="Arial" w:hAnsi="Arial" w:cs="Arial"/>
-          <w:sz w:val="26"/>
-          <w:sz-cs w:val="26"/>
-          <w:spacing w:val="0"/>
-          <w:color w:val="141414"/>
-        </w:rPr>
-        <w:t xml:space="preserve">Designed and executed test coverage spanning API, database, and reporting layers — including DCC rebate/markup calculation, multi-currency settlement, and card BIN data validation pipelines.</w:t>
+        <w:t xml:space="preserve">Lead QA for Astra Tech's merchant acquiring &amp; payment core platform (Botim), covering CIT/MIT-compliant payment flows (Visa/Mastercard stored-credential framework), recurring/tokenized (subscription) payments, and dynamic currency conversion (DCC) across millions of transactions.</w:t>
+      </w:r>
+    </w:p>
+    <w:p>
+      <w:pPr>
+        <w:ind w:left="720" w:first-line="-720"/>
+        <w:spacing w:after="30"/>
+      </w:pPr>
+      <w:r>
+        <w:rPr>
+          <w:rFonts w:ascii="Arial" w:hAnsi="Arial" w:cs="Arial"/>
+          <w:sz w:val="26"/>
+          <w:sz-cs w:val="26"/>
+          <w:color w:val="141414"/>
+        </w:rPr>
+        <w:t xml:space="preserve"/>
+        <w:tab/>
+        <w:t xml:space="preserve">•</w:t>
+        <w:tab/>
+        <w:t xml:space="preserve"/>
+      </w:r>
+      <w:r>
+        <w:rPr>
+          <w:rFonts w:ascii="Arial" w:hAnsi="Arial" w:cs="Arial"/>
+          <w:sz w:val="26"/>
+          <w:sz-cs w:val="26"/>
+          <w:spacing w:val="0"/>
+          <w:color w:val="141414"/>
+        </w:rPr>
+        <w:t xml:space="preserve">Test the merchant-facing admin portal (DCC/rebate detail views, statement and report downloads, merchant auth configuration) alongside backend APIs, databases, and card BIN data-integrity pipelines.</w:t>
+      </w:r>
+    </w:p>
+    <w:p>
+      <w:pPr>
+        <w:ind w:left="720" w:first-line="-720"/>
+        <w:spacing w:after="30"/>
+      </w:pPr>
+      <w:r>
+        <w:rPr>
+          <w:rFonts w:ascii="Arial" w:hAnsi="Arial" w:cs="Arial"/>
+          <w:sz w:val="26"/>
+          <w:sz-cs w:val="26"/>
+          <w:color w:val="141414"/>
+        </w:rPr>
+        <w:t xml:space="preserve"/>
+        <w:tab/>
+        <w:t xml:space="preserve">•</w:t>
+        <w:tab/>
+        <w:t xml:space="preserve"/>
+      </w:r>
+      <w:r>
+        <w:rPr>
+          <w:rFonts w:ascii="Arial" w:hAnsi="Arial" w:cs="Arial"/>
+          <w:sz w:val="26"/>
+          <w:sz-cs w:val="26"/>
+          <w:spacing w:val="0"/>
+          <w:color w:val="141414"/>
+        </w:rPr>
+        <w:t xml:space="preserve">Designed and executed test coverage spanning API, database, portal UI, and reporting layers — including DCC rebate/markup calculation, multi-currency settlement, and statement/reporting system performance.</w:t>
       </w:r>
     </w:p>
     <w:p>
@@ -314,36 +343,36 @@
           <w:spacing w:val="0"/>
           <w:color w:val="141414"/>
         </w:rPr>
-        <w:t xml:space="preserve">Identified and drove to resolution production-impacting defects across the stack, including a SQL-injection input-validation gap in a card-data import pipeline and multiple currency/configuration edge cases in DCC rebate calculation.</w:t>
-      </w:r>
-    </w:p>
-    <w:p>
-      <w:pPr>
-        <w:ind w:left="720" w:first-line="-720"/>
-        <w:spacing w:after="30"/>
-      </w:pPr>
-      <w:r>
-        <w:rPr>
-          <w:rFonts w:ascii="Arial" w:hAnsi="Arial" w:cs="Arial"/>
-          <w:sz w:val="26"/>
-          <w:sz-cs w:val="26"/>
-          <w:color w:val="141414"/>
-        </w:rPr>
-        <w:t xml:space="preserve"/>
-        <w:tab/>
-        <w:t xml:space="preserve">•</w:t>
-        <w:tab/>
-        <w:t xml:space="preserve"/>
-      </w:r>
-      <w:r>
-        <w:rPr>
-          <w:rFonts w:ascii="Arial" w:hAnsi="Arial" w:cs="Arial"/>
-          <w:sz w:val="26"/>
-          <w:sz-cs w:val="26"/>
-          <w:spacing w:val="0"/>
-          <w:color w:val="141414"/>
-        </w:rPr>
-        <w:t xml:space="preserve">Integrated the full automated suite into Jenkins CI/CD, combining cross-browser frontend coverage with backend API verification in a single pipeline.</w:t>
+        <w:t xml:space="preserve">Identified and drove to resolution production-impacting defects across the stack, including a SQL-injection input-validation gap in a card-data pipeline, multiple currency/configuration edge cases in DCC rebate calculation, and data-integrity issues in automated reporting/notification pipelines.</w:t>
+      </w:r>
+    </w:p>
+    <w:p>
+      <w:pPr>
+        <w:ind w:left="720" w:first-line="-720"/>
+        <w:spacing w:after="30"/>
+      </w:pPr>
+      <w:r>
+        <w:rPr>
+          <w:rFonts w:ascii="Arial" w:hAnsi="Arial" w:cs="Arial"/>
+          <w:sz w:val="26"/>
+          <w:sz-cs w:val="26"/>
+          <w:color w:val="141414"/>
+        </w:rPr>
+        <w:t xml:space="preserve"/>
+        <w:tab/>
+        <w:t xml:space="preserve">•</w:t>
+        <w:tab/>
+        <w:t xml:space="preserve"/>
+      </w:r>
+      <w:r>
+        <w:rPr>
+          <w:rFonts w:ascii="Arial" w:hAnsi="Arial" w:cs="Arial"/>
+          <w:sz w:val="26"/>
+          <w:sz-cs w:val="26"/>
+          <w:spacing w:val="0"/>
+          <w:color w:val="141414"/>
+        </w:rPr>
+        <w:t xml:space="preserve">Integrated the full automated suite into Jenkins CI/CD, combining cross-browser frontend, portal, and backend API verification in a single pipeline.</w:t>
       </w:r>
     </w:p>
     <w:p>

</xml_diff>

<commit_message>
Style contact links as visibly clickable
Email, LinkedIn, portfolio, and GitHub links were already embedded as real
clickable URI annotations in the PDF, but styled the same color as body
text. Now colored + underlined so they visually read as links too.
</commit_message>
<xml_diff>
--- a/CV_Mohamed_Elaadly.docx
+++ b/CV_Mohamed_Elaadly.docx
@@ -35,8 +35,9 @@
           <w:rFonts w:ascii="Arial" w:hAnsi="Arial" w:cs="Arial"/>
           <w:sz w:val="23"/>
           <w:sz-cs w:val="23"/>
-          <w:spacing w:val="0"/>
-          <w:color w:val="141414"/>
+          <w:u w:val="single"/>
+          <w:spacing w:val="0"/>
+          <w:color w:val="1640A0"/>
         </w:rPr>
         <w:t xml:space="preserve">mohamedbasem512@gmail.com</w:t>
       </w:r>
@@ -55,8 +56,9 @@
           <w:rFonts w:ascii="Arial" w:hAnsi="Arial" w:cs="Arial"/>
           <w:sz w:val="23"/>
           <w:sz-cs w:val="23"/>
-          <w:spacing w:val="0"/>
-          <w:color w:val="141414"/>
+          <w:u w:val="single"/>
+          <w:spacing w:val="0"/>
+          <w:color w:val="1640A0"/>
         </w:rPr>
         <w:t xml:space="preserve">linkedin.com/in/mohamed-basem-848135180</w:t>
       </w:r>
@@ -88,8 +90,9 @@
           <w:rFonts w:ascii="Arial" w:hAnsi="Arial" w:cs="Arial"/>
           <w:sz w:val="23"/>
           <w:sz-cs w:val="23"/>
-          <w:spacing w:val="0"/>
-          <w:color w:val="141414"/>
+          <w:u w:val="single"/>
+          <w:spacing w:val="0"/>
+          <w:color w:val="1640A0"/>
         </w:rPr>
         <w:t xml:space="preserve">mohbasem25.github.io</w:t>
       </w:r>
@@ -108,8 +111,9 @@
           <w:rFonts w:ascii="Arial" w:hAnsi="Arial" w:cs="Arial"/>
           <w:sz w:val="23"/>
           <w:sz-cs w:val="23"/>
-          <w:spacing w:val="0"/>
-          <w:color w:val="141414"/>
+          <w:u w:val="single"/>
+          <w:spacing w:val="0"/>
+          <w:color w:val="1640A0"/>
         </w:rPr>
         <w:t xml:space="preserve">github.com/mohbasem25</w:t>
       </w:r>

</xml_diff>

<commit_message>
Add 2 new AI-testing projects to portfolio site and main CV
qa-ml-model-evaluation-testing (real Hugging Face model, 81.8% accuracy,
honest 25% sarcasm finding) and qa-llm-testing-framework (5 verified
findings) — bringing the total to 9 repos.
</commit_message>
<xml_diff>
--- a/CV_Mohamed_Elaadly.docx
+++ b/CV_Mohamed_Elaadly.docx
@@ -1448,6 +1448,86 @@
           <w:color w:val="262626"/>
         </w:rPr>
         <w:t xml:space="preserve">OWASP API Security Top 10 applied to a payment API: 5 real findings (IDOR, broken auth, data exposure, injection, forged webhooks) independently confirmed exploitable, with a professional findings report.</w:t>
+      </w:r>
+    </w:p>
+    <w:p>
+      <w:pPr/>
+      <w:r>
+        <w:rPr>
+          <w:rFonts w:ascii="Arial" w:hAnsi="Arial" w:cs="Arial"/>
+          <w:sz w:val="24"/>
+          <w:sz-cs w:val="24"/>
+          <w:b/>
+          <w:u w:val="single"/>
+          <w:spacing w:val="0"/>
+          <w:color w:val="0000E9"/>
+        </w:rPr>
+        <w:t xml:space="preserve">qa-ml-model-evaluation-testing</w:t>
+      </w:r>
+      <w:r>
+        <w:rPr>
+          <w:rFonts w:ascii="Arial" w:hAnsi="Arial" w:cs="Arial"/>
+          <w:sz w:val="24"/>
+          <w:sz-cs w:val="24"/>
+          <w:spacing w:val="0"/>
+          <w:color w:val="141414"/>
+        </w:rPr>
+        <w:t xml:space="preserve"/>
+      </w:r>
+    </w:p>
+    <w:p>
+      <w:pPr>
+        <w:spacing w:after="60"/>
+      </w:pPr>
+      <w:r>
+        <w:rPr>
+          <w:rFonts w:ascii="Arial" w:hAnsi="Arial" w:cs="Arial"/>
+          <w:sz w:val="23"/>
+          <w:sz-cs w:val="23"/>
+          <w:spacing w:val="0"/>
+          <w:color w:val="262626"/>
+        </w:rPr>
+        <w:t xml:space="preserve">Precision/recall/F1 benchmarking of a real Hugging Face sentiment model across 74 hand-curated cases: 81.8% overall accuracy, with sarcasm accuracy dropping to 25% — plus adversarial/robustness and fairness-probe testing.</w:t>
+      </w:r>
+    </w:p>
+    <w:p>
+      <w:pPr/>
+      <w:r>
+        <w:rPr>
+          <w:rFonts w:ascii="Arial" w:hAnsi="Arial" w:cs="Arial"/>
+          <w:sz w:val="24"/>
+          <w:sz-cs w:val="24"/>
+          <w:b/>
+          <w:u w:val="single"/>
+          <w:spacing w:val="0"/>
+          <w:color w:val="0000E9"/>
+        </w:rPr>
+        <w:t xml:space="preserve">qa-llm-testing-framework</w:t>
+      </w:r>
+      <w:r>
+        <w:rPr>
+          <w:rFonts w:ascii="Arial" w:hAnsi="Arial" w:cs="Arial"/>
+          <w:sz w:val="24"/>
+          <w:sz-cs w:val="24"/>
+          <w:spacing w:val="0"/>
+          <w:color w:val="141414"/>
+        </w:rPr>
+        <w:t xml:space="preserve"/>
+      </w:r>
+    </w:p>
+    <w:p>
+      <w:pPr>
+        <w:spacing w:after="60"/>
+      </w:pPr>
+      <w:r>
+        <w:rPr>
+          <w:rFonts w:ascii="Arial" w:hAnsi="Arial" w:cs="Arial"/>
+          <w:sz w:val="23"/>
+          <w:sz-cs w:val="23"/>
+          <w:spacing w:val="0"/>
+          <w:color w:val="262626"/>
+        </w:rPr>
+        <w:t xml:space="preserve">LLM output testing: consistency, structured-output validation, prompt-injection resistance, hallucination spot-checks, and refusal-boundary testing — 5 real findings independently verified via actual test runs.</w:t>
       </w:r>
     </w:p>
     <w:p>

</xml_diff>

<commit_message>
Update current employer display name to Botim Astra Tech
</commit_message>
<xml_diff>
--- a/CV_Mohamed_Elaadly.docx
+++ b/CV_Mohamed_Elaadly.docx
@@ -154,7 +154,7 @@
           <w:spacing w:val="0"/>
           <w:color w:val="141414"/>
         </w:rPr>
-        <w:t xml:space="preserve">ISTQB-certified QA Engineer (Foundation, Test Automation Engineering, Performance Testing, Automotive) with 5+ years testing web, mobile, and API systems across fintech payments, automotive safety, and AI/ML products. Currently lead QA for Astra Tech's merchant acquiring &amp; payment core platform (Botim), covering CIT/MIT-compliant payment flows (the Visa/Mastercard stored-credential framework), recurring/tokenized payments, dynamic currency conversion (DCC), card data integrity, and the merchant-facing admin portal — where I raised automated test coverage from 60% to 87% and mentor a team of three engineers. Built automation frameworks in Playwright, Appium, and REST Assured across Java and Python, and have validated AI systems (static analysis, NLP, classification) for correctness beyond fixed-answer testing. Comfortable owning quality end-to-end: test strategy, framework architecture, CI/CD integration, and defect triage in Agile teams with distributed stakeholders (Germany, Romania, UAE, Egypt).</w:t>
+        <w:t xml:space="preserve">ISTQB-certified QA Engineer (Foundation, Test Automation Engineering, Performance Testing, Automotive) with 5+ years testing web, mobile, and API systems across fintech payments, automotive safety, and AI/ML products. Currently lead QA for Botim Astra Tech's merchant acquiring &amp; payment core platform, covering CIT/MIT-compliant payment flows (the Visa/Mastercard stored-credential framework), recurring/tokenized payments, dynamic currency conversion (DCC), card data integrity, and the merchant-facing admin portal — where I raised automated test coverage from 60% to 87% and mentor a team of three engineers. Built automation frameworks in Playwright, Appium, and REST Assured across Java and Python, and have validated AI systems (static analysis, NLP, classification) for correctness beyond fixed-answer testing. Comfortable owning quality end-to-end: test strategy, framework architecture, CI/CD integration, and defect triage in Agile teams with distributed stakeholders (Germany, Romania, UAE, Egypt).</w:t>
       </w:r>
     </w:p>
     <w:p>
@@ -186,7 +186,7 @@
           <w:spacing w:val="0"/>
           <w:color w:val="141414"/>
         </w:rPr>
-        <w:t xml:space="preserve">Quality Assurance Engineer — Astra Tech</w:t>
+        <w:t xml:space="preserve">Quality Assurance Engineer — Botim Astra Tech</w:t>
       </w:r>
     </w:p>
     <w:p>
@@ -231,7 +231,7 @@
           <w:spacing w:val="0"/>
           <w:color w:val="141414"/>
         </w:rPr>
-        <w:t xml:space="preserve">Lead QA for Astra Tech's merchant acquiring &amp; payment core platform (Botim), covering CIT/MIT-compliant payment flows (Visa/Mastercard stored-credential framework), recurring/tokenized (subscription) payments, and dynamic currency conversion (DCC) across millions of transactions.</w:t>
+        <w:t xml:space="preserve">Lead QA for Botim Astra Tech's merchant acquiring &amp; payment core platform, covering CIT/MIT-compliant payment flows (Visa/Mastercard stored-credential framework), recurring/tokenized (subscription) payments, and dynamic currency conversion (DCC) across millions of transactions.</w:t>
       </w:r>
     </w:p>
     <w:p>

</xml_diff>

<commit_message>
Add highlighted Featured Videos box to CV (separate from Summary)
</commit_message>
<xml_diff>
--- a/CV_Mohamed_Elaadly.docx
+++ b/CV_Mohamed_Elaadly.docx
@@ -154,7 +154,136 @@
           <w:spacing w:val="0"/>
           <w:color w:val="141414"/>
         </w:rPr>
-        <w:t xml:space="preserve">ISTQB-certified QA Engineer (Foundation, Test Automation Engineering, Performance Testing, Automotive) with 5+ years testing web, mobile, and API systems across fintech payments, automotive safety, and AI/ML products. Currently lead QA for Botim Astra Tech's merchant acquiring &amp; payment core platform, covering CIT/MIT-compliant payment flows (the Visa/Mastercard stored-credential framework), recurring/tokenized payments, dynamic currency conversion (DCC), card data integrity, and the merchant-facing admin portal — where I raised automated test coverage from 60% to 87% and mentor a team of three engineers. Built automation frameworks in Playwright, Appium, and REST Assured across Java and Python, and have validated AI systems (static analysis, NLP, classification) for correctness beyond fixed-answer testing. Comfortable owning quality end-to-end: test strategy, framework architecture, CI/CD integration, and defect triage in Agile teams with distributed stakeholders (Germany, Romania, UAE, Egypt). Also create short video content on LinkedIn explaining testing concepts (featured on my portfolio site).</w:t>
+        <w:t xml:space="preserve">ISTQB-certified QA Engineer (Foundation, Test Automation Engineering, Performance Testing, Automotive) with 5+ years testing web, mobile, and API systems across fintech payments, automotive safety, and AI/ML products. Currently lead QA for Botim Astra Tech's merchant acquiring &amp; payment core platform, covering CIT/MIT-compliant payment flows (the Visa/Mastercard stored-credential framework), recurring/tokenized payments, dynamic currency conversion (DCC), card data integrity, and the merchant-facing admin portal — where I raised automated test coverage from 60% to 87% and mentor a team of three engineers. Built automation frameworks in Playwright, Appium, and REST Assured across Java and Python, and have validated AI systems (static analysis, NLP, classification) for correctness beyond fixed-answer testing. Comfortable owning quality end-to-end: test strategy, framework architecture, CI/CD integration, and defect triage in Agile teams with distributed stakeholders (Germany, Romania, UAE, Egypt).</w:t>
+      </w:r>
+    </w:p>
+    <w:p>
+      <w:pPr/>
+      <w:r>
+        <w:rPr>
+          <w:rFonts w:ascii="Arial" w:hAnsi="Arial" w:cs="Arial"/>
+          <w:sz w:val="23"/>
+          <w:sz-cs w:val="23"/>
+          <w:b/>
+          <w:spacing w:val="0"/>
+          <w:color w:val="1640A0"/>
+        </w:rPr>
+        <w:t xml:space="preserve">🎥 Featured Videos</w:t>
+      </w:r>
+      <w:r>
+        <w:rPr>
+          <w:rFonts w:ascii="Arial" w:hAnsi="Arial" w:cs="Arial"/>
+          <w:sz w:val="23"/>
+          <w:sz-cs w:val="23"/>
+          <w:spacing w:val="0"/>
+          <w:color w:val="141414"/>
+        </w:rPr>
+        <w:t xml:space="preserve"> — I create short testing-explainer videos on LinkedIn, also featured on my portfolio: </w:t>
+      </w:r>
+      <w:r>
+        <w:rPr>
+          <w:rFonts w:ascii="Arial" w:hAnsi="Arial" w:cs="Arial"/>
+          <w:sz w:val="23"/>
+          <w:sz-cs w:val="23"/>
+          <w:b/>
+          <w:spacing w:val="0"/>
+          <w:color w:val="141414"/>
+        </w:rPr>
+        <w:t xml:space="preserve">Error vs. Defect vs. Failure vs. Root Cause</w:t>
+      </w:r>
+      <w:r>
+        <w:rPr>
+          <w:rFonts w:ascii="Arial" w:hAnsi="Arial" w:cs="Arial"/>
+          <w:sz w:val="23"/>
+          <w:sz-cs w:val="23"/>
+          <w:spacing w:val="0"/>
+          <w:color w:val="141414"/>
+        </w:rPr>
+        <w:t xml:space="preserve"> · </w:t>
+      </w:r>
+      <w:r>
+        <w:rPr>
+          <w:rFonts w:ascii="Arial" w:hAnsi="Arial" w:cs="Arial"/>
+          <w:sz w:val="23"/>
+          <w:sz-cs w:val="23"/>
+          <w:b/>
+          <w:spacing w:val="0"/>
+          <w:color w:val="141414"/>
+        </w:rPr>
+        <w:t xml:space="preserve">6 Performance Testing Types</w:t>
+      </w:r>
+      <w:r>
+        <w:rPr>
+          <w:rFonts w:ascii="Arial" w:hAnsi="Arial" w:cs="Arial"/>
+          <w:sz w:val="23"/>
+          <w:sz-cs w:val="23"/>
+          <w:spacing w:val="0"/>
+          <w:color w:val="141414"/>
+        </w:rPr>
+        <w:t xml:space="preserve"> · </w:t>
+      </w:r>
+      <w:r>
+        <w:rPr>
+          <w:rFonts w:ascii="Arial" w:hAnsi="Arial" w:cs="Arial"/>
+          <w:sz w:val="23"/>
+          <w:sz-cs w:val="23"/>
+          <w:b/>
+          <w:spacing w:val="0"/>
+          <w:color w:val="141414"/>
+        </w:rPr>
+        <w:t xml:space="preserve">ISTQB CTFL Chapter 3: Static Testing</w:t>
+      </w:r>
+      <w:r>
+        <w:rPr>
+          <w:rFonts w:ascii="Arial" w:hAnsi="Arial" w:cs="Arial"/>
+          <w:sz w:val="23"/>
+          <w:sz-cs w:val="23"/>
+          <w:spacing w:val="0"/>
+          <w:color w:val="141414"/>
+        </w:rPr>
+        <w:t xml:space="preserve"> · </w:t>
+      </w:r>
+      <w:r>
+        <w:rPr>
+          <w:rFonts w:ascii="Arial" w:hAnsi="Arial" w:cs="Arial"/>
+          <w:sz w:val="23"/>
+          <w:sz-cs w:val="23"/>
+          <w:b/>
+          <w:spacing w:val="0"/>
+          <w:color w:val="141414"/>
+        </w:rPr>
+        <w:t xml:space="preserve">A Small Defect Can Be a Financial Incident</w:t>
+      </w:r>
+      <w:r>
+        <w:rPr>
+          <w:rFonts w:ascii="Arial" w:hAnsi="Arial" w:cs="Arial"/>
+          <w:sz w:val="23"/>
+          <w:sz-cs w:val="23"/>
+          <w:spacing w:val="0"/>
+          <w:color w:val="141414"/>
+        </w:rPr>
+        <w:t xml:space="preserve"> — </w:t>
+      </w:r>
+      <w:r>
+        <w:rPr>
+          <w:rFonts w:ascii="Arial" w:hAnsi="Arial" w:cs="Arial"/>
+          <w:sz w:val="23"/>
+          <w:sz-cs w:val="23"/>
+          <w:u w:val="single"/>
+          <w:spacing w:val="0"/>
+          <w:color w:val="1640A0"/>
+        </w:rPr>
+        <w:t xml:space="preserve">watch at mohbasem25.github.io/#videos</w:t>
+      </w:r>
+      <w:r>
+        <w:rPr>
+          <w:rFonts w:ascii="Arial" w:hAnsi="Arial" w:cs="Arial"/>
+          <w:sz w:val="23"/>
+          <w:sz-cs w:val="23"/>
+          <w:spacing w:val="0"/>
+          <w:color w:val="141414"/>
+        </w:rPr>
+        <w:t xml:space="preserve"/>
       </w:r>
     </w:p>
     <w:p>

</xml_diff>

<commit_message>
Reframe video section: internal QA lectures at Botim Astra Tech, not generic content
Grounded in real activity (in-person training sessions with colleagues,
visible in the video thumbnails) rather than a 'professional lecturer' title
the author doesn't formally hold.
</commit_message>
<xml_diff>
--- a/CV_Mohamed_Elaadly.docx
+++ b/CV_Mohamed_Elaadly.docx
@@ -168,17 +168,17 @@
           <w:spacing w:val="0"/>
           <w:color w:val="1640A0"/>
         </w:rPr>
-        <w:t xml:space="preserve">🎥 Featured Videos</w:t>
-      </w:r>
-      <w:r>
-        <w:rPr>
-          <w:rFonts w:ascii="Arial" w:hAnsi="Arial" w:cs="Arial"/>
-          <w:sz w:val="23"/>
-          <w:sz-cs w:val="23"/>
-          <w:spacing w:val="0"/>
-          <w:color w:val="141414"/>
-        </w:rPr>
-        <w:t xml:space="preserve"> — I create short testing-explainer videos on LinkedIn, also featured on my portfolio: </w:t>
+        <w:t xml:space="preserve">🎥 I lecture my QA colleagues at Botim Astra Tech on ISTQB certifications and software testing concepts</w:t>
+      </w:r>
+      <w:r>
+        <w:rPr>
+          <w:rFonts w:ascii="Arial" w:hAnsi="Arial" w:cs="Arial"/>
+          <w:sz w:val="23"/>
+          <w:sz-cs w:val="23"/>
+          <w:spacing w:val="0"/>
+          <w:color w:val="141414"/>
+        </w:rPr>
+        <w:t xml:space="preserve"> — short clips on LinkedIn, also featured on my portfolio: </w:t>
       </w:r>
       <w:r>
         <w:rPr>

</xml_diff>